<commit_message>
feat: expand audit logging for auth and request activity
Co-authored-by: Copilot <223556219+Copilot@users.noreply.github.com>
</commit_message>
<xml_diff>
--- a/docs/SportHub_System_Evaluation_Questionnaire.docx
+++ b/docs/SportHub_System_Evaluation_Questionnaire.docx
@@ -75,15 +75,7 @@
         <w:rPr>
           <w:sz w:val="22"/>
         </w:rPr>
-        <w:t xml:space="preserve">This questionnaire aims to evaluate the quality and acceptability of the SportHub system. Your honest responses will help identify the system’s strengths and the areas that need improvement. All </w:t>
-      </w:r>
-      <w:bookmarkStart w:id="0" w:name="_GoBack"/>
-      <w:bookmarkEnd w:id="0"/>
-      <w:r>
-        <w:rPr>
-          <w:sz w:val="22"/>
-        </w:rPr>
-        <w:t>information you provide will be treated with strict confidentiality and used solely for evaluation purposes.</w:t>
+        <w:t>This questionnaire aims to evaluate the quality and acceptability of the SportHub system. Your honest responses will help identify the system’s strengths and the areas that need improvement. All information you provide will be treated with strict confidentiality and used solely for evaluation purposes.</w:t>
       </w:r>
     </w:p>
     <w:p>
@@ -198,7 +190,7 @@
         </w:tblPrEx>
         <w:tc>
           <w:tcPr>
-            <w:tcW w:w="0" w:type="dxa"/>
+            <w:tcW w:w="9360" w:type="dxa"/>
             <w:shd w:val="clear" w:color="auto" w:fill="F2F2F2"/>
             <w:vAlign w:val="center"/>
           </w:tcPr>
@@ -209,10 +201,75 @@
             <w:r>
               <w:t>☐  IT Professional / IT Student                         ☐  Non-IT / General User / Stakeholder</w:t>
             </w:r>
+          </w:p>
+        </w:tc>
+      </w:tr>
+      <w:tr>
+        <w:tblPrEx>
+          <w:tblBorders>
+            <w:top w:val="single" w:color="808080" w:sz="4" w:space="0"/>
+            <w:left w:val="single" w:color="808080" w:sz="4" w:space="0"/>
+            <w:bottom w:val="single" w:color="808080" w:sz="4" w:space="0"/>
+            <w:right w:val="single" w:color="808080" w:sz="4" w:space="0"/>
+            <w:insideH w:val="none" w:color="auto" w:sz="0" w:space="0"/>
+            <w:insideV w:val="none" w:color="auto" w:sz="0" w:space="0"/>
+          </w:tblBorders>
+          <w:tblCellMar>
+            <w:top w:w="0" w:type="dxa"/>
+            <w:left w:w="10" w:type="dxa"/>
+            <w:bottom w:w="0" w:type="dxa"/>
+            <w:right w:w="10" w:type="dxa"/>
+          </w:tblCellMar>
+        </w:tblPrEx>
+        <w:tc>
+          <w:tcPr>
+            <w:tcW w:w="9360" w:type="dxa"/>
+            <w:shd w:val="clear" w:color="auto" w:fill="F2F2F2"/>
+            <w:vAlign w:val="center"/>
+          </w:tcPr>
+          <w:p>
+            <w:pPr>
+              <w:jc w:val="left"/>
+            </w:pPr>
+            <w:r>
+              <w:rPr>
+                <w:rFonts w:ascii="docs-Lexend" w:hAnsi="docs-Lexend" w:eastAsia="docs-Lexend" w:cs="docs-Lexend"/>
+                <w:i w:val="0"/>
+                <w:iCs w:val="0"/>
+                <w:caps w:val="0"/>
+                <w:color w:val="1F1F1F"/>
+                <w:spacing w:val="0"/>
+                <w:sz w:val="24"/>
+                <w:szCs w:val="24"/>
+                <w:shd w:val="clear" w:fill="F2F2F2"/>
+              </w:rPr>
+              <w:br w:type="textWrapping"/>
+            </w:r>
+            <w:bookmarkStart w:id="0" w:name="_GoBack"/>
+            <w:r>
+              <w:rPr>
+                <w:rFonts w:hint="default" w:ascii="docs-Lexend" w:hAnsi="docs-Lexend" w:eastAsia="docs-Lexend" w:cs="docs-Lexend"/>
+                <w:i w:val="0"/>
+                <w:iCs w:val="0"/>
+                <w:caps w:val="0"/>
+                <w:color w:val="1F1F1F"/>
+                <w:spacing w:val="0"/>
+                <w:sz w:val="24"/>
+                <w:szCs w:val="24"/>
+                <w:shd w:val="clear" w:fill="F2F2F2"/>
+              </w:rPr>
+              <w:t>How long have you been working in the tech industry? (For Personnel / It Professional only)</w:t>
+            </w:r>
+            <w:bookmarkEnd w:id="0"/>
           </w:p>
         </w:tc>
       </w:tr>
     </w:tbl>
+    <w:p>
+      <w:pPr>
+        <w:spacing w:after="120"/>
+      </w:pPr>
+    </w:p>
     <w:p>
       <w:pPr>
         <w:spacing w:after="120"/>
@@ -6676,7 +6733,7 @@
   <w:docDefaults>
     <w:rPrDefault>
       <w:rPr>
-        <w:rFonts w:ascii="Calibri" w:hAnsi="Calibri" w:eastAsiaTheme="minorEastAsia" w:cs="Calibri"/>
+        <w:rFonts w:ascii="Times New Roman" w:hAnsi="Times New Roman" w:eastAsia="SimSun" w:cs="Times New Roman"/>
       </w:rPr>
     </w:rPrDefault>
     <w:pPrDefault/>
@@ -6936,7 +6993,7 @@
     <w:qFormat/>
     <w:uiPriority w:val="0"/>
     <w:rPr>
-      <w:rFonts w:ascii="Calibri" w:hAnsi="Calibri" w:cs="Calibri"/>
+      <w:rFonts w:ascii="Calibri" w:hAnsi="Calibri" w:cs="Calibri" w:eastAsiaTheme="minorEastAsia"/>
       <w:sz w:val="22"/>
     </w:rPr>
   </w:style>

</xml_diff>